<commit_message>
Strengthen ATS template SERP and hero so the page reads like a professional template recruiters expect.
Unify title/OG/meta for download intent, add HowTo schema, upgrade Jordan Lee to senior BA with quantified bullets, add ATS safe vs risky comparison, and regenerate Word/txt downloads.

Co-authored-by: Cursor <cursoragent@cursor.com>
</commit_message>
<xml_diff>
--- a/public/downloads/ats-resume-template.docx
+++ b/public/downloads/ats-resume-template.docx
@@ -25,7 +25,7 @@
           <w:sz w:val="22"/>
           <w:szCs w:val="22"/>
         </w:rPr>
-        <w:t xml:space="preserve">Boston, MA · jordan.lee@email.com · (555) 010-0199 · linkedin.com/in/jordanlee</w:t>
+        <w:t xml:space="preserve">Chicago, IL · jordan.lee@email.com · (555) 010-0199 · linkedin.com/in/jordanlee</w:t>
       </w:r>
     </w:p>
     <w:p>
@@ -64,7 +64,7 @@
           <w:sz w:val="22"/>
           <w:szCs w:val="22"/>
         </w:rPr>
-        <w:t xml:space="preserve">Economics graduate targeting operations analytics roles. Internship-proven at turning messy operational data into weekly KPI packs, exec-ready Excel readouts, and SQL-backed answers for account managers—comfortable owning the loop from raw tables to clear stakeholder updates under tight deadlines.</w:t>
+        <w:t xml:space="preserve">Senior business analyst with 8+ years translating requirements into shipped solutions. Delivers SQL-backed reporting, executive dashboards, and cross-functional alignment that improves forecast accuracy and cycle time across finance and operations.</w:t>
       </w:r>
     </w:p>
     <w:p>
@@ -103,7 +103,7 @@
           <w:sz w:val="22"/>
           <w:szCs w:val="22"/>
         </w:rPr>
-        <w:t xml:space="preserve">SQL · Microsoft Excel · Google Sheets · Tableau (basics) · Python (pandas, introductory)</w:t>
+        <w:t xml:space="preserve">SQL · Power BI · Tableau · Excel · Requirements gathering · Process mapping · Jira · Stakeholder management</w:t>
       </w:r>
     </w:p>
     <w:p>
@@ -142,33 +142,59 @@
           <w:sz w:val="22"/>
           <w:szCs w:val="22"/>
         </w:rPr>
-        <w:t xml:space="preserve">Operations Analytics Intern · Acme Logistics · Jun 2023–Aug 2024</w:t>
-      </w:r>
-    </w:p>
-    <w:p>
-      <w:pPr>
-        <w:spacing w:after="80"/>
-      </w:pPr>
-      <w:r>
-        <w:rPr>
-          <w:rFonts w:ascii="Calibri" w:cs="Calibri" w:eastAsia="Calibri" w:hAnsi="Calibri"/>
-          <w:sz w:val="22"/>
-          <w:szCs w:val="22"/>
-        </w:rPr>
-        <w:t xml:space="preserve">• Built weekly KPI pack in Excel; reduced prep time from roughly 4 hours to under 90 minutes.</w:t>
-      </w:r>
-    </w:p>
-    <w:p>
-      <w:pPr>
-        <w:spacing w:after="80"/>
-      </w:pPr>
-      <w:r>
-        <w:rPr>
-          <w:rFonts w:ascii="Calibri" w:cs="Calibri" w:eastAsia="Calibri" w:hAnsi="Calibri"/>
-          <w:sz w:val="22"/>
-          <w:szCs w:val="22"/>
-        </w:rPr>
-        <w:t xml:space="preserve">• Joined and cleaned shipment-level tables (5k+ rows/week) for ad-hoc questions from account managers.</w:t>
+        <w:t xml:space="preserve">Senior Business Analyst · Northwind Financial · 2019-Present</w:t>
+      </w:r>
+    </w:p>
+    <w:p>
+      <w:pPr>
+        <w:spacing w:after="80"/>
+      </w:pPr>
+      <w:r>
+        <w:rPr>
+          <w:rFonts w:ascii="Calibri" w:cs="Calibri" w:eastAsia="Calibri" w:hAnsi="Calibri"/>
+          <w:sz w:val="22"/>
+          <w:szCs w:val="22"/>
+        </w:rPr>
+        <w:t xml:space="preserve">• Led requirements workshops with 12 stakeholders; delivered a unified KPI framework adopted across finance and ops, reducing conflicting metrics by 38%.</w:t>
+      </w:r>
+    </w:p>
+    <w:p>
+      <w:pPr>
+        <w:spacing w:after="80"/>
+      </w:pPr>
+      <w:r>
+        <w:rPr>
+          <w:rFonts w:ascii="Calibri" w:cs="Calibri" w:eastAsia="Calibri" w:hAnsi="Calibri"/>
+          <w:sz w:val="22"/>
+          <w:szCs w:val="22"/>
+        </w:rPr>
+        <w:t xml:space="preserve">• Built Power BI executive dashboard suite; cut monthly close reporting time from 6 days to 2.5 days.</w:t>
+      </w:r>
+    </w:p>
+    <w:p>
+      <w:pPr>
+        <w:spacing w:after="80"/>
+      </w:pPr>
+      <w:r>
+        <w:rPr>
+          <w:rFonts w:ascii="Calibri" w:cs="Calibri" w:eastAsia="Calibri" w:hAnsi="Calibri"/>
+          <w:sz w:val="22"/>
+          <w:szCs w:val="22"/>
+        </w:rPr>
+        <w:t xml:space="preserve">• Mapped order-to-cash processes and authored 140+ user stories; accelerated release cadence by 22% over three quarters.</w:t>
+      </w:r>
+    </w:p>
+    <w:p>
+      <w:pPr>
+        <w:spacing w:after="80"/>
+      </w:pPr>
+      <w:r>
+        <w:rPr>
+          <w:rFonts w:ascii="Calibri" w:cs="Calibri" w:eastAsia="Calibri" w:hAnsi="Calibri"/>
+          <w:sz w:val="22"/>
+          <w:szCs w:val="22"/>
+        </w:rPr>
+        <w:t xml:space="preserve">• Partnered with engineering on API integration specs; reduced production defects tied to requirements gaps by 31%.</w:t>
       </w:r>
     </w:p>
     <w:p>
@@ -194,33 +220,33 @@
           <w:sz w:val="22"/>
           <w:szCs w:val="22"/>
         </w:rPr>
-        <w:t xml:space="preserve">PROJECTS</w:t>
-      </w:r>
-    </w:p>
-    <w:p>
-      <w:pPr>
-        <w:spacing w:after="80"/>
-      </w:pPr>
-      <w:r>
-        <w:rPr>
-          <w:rFonts w:ascii="Calibri" w:cs="Calibri" w:eastAsia="Calibri" w:hAnsi="Calibri"/>
-          <w:sz w:val="22"/>
-          <w:szCs w:val="22"/>
-        </w:rPr>
-        <w:t xml:space="preserve">Campus operations KPI dashboard (Tableau + SQL) · Academic project · team of 3</w:t>
-      </w:r>
-    </w:p>
-    <w:p>
-      <w:pPr>
-        <w:spacing w:after="80"/>
-      </w:pPr>
-      <w:r>
-        <w:rPr>
-          <w:rFonts w:ascii="Calibri" w:cs="Calibri" w:eastAsia="Calibri" w:hAnsi="Calibri"/>
-          <w:sz w:val="22"/>
-          <w:szCs w:val="22"/>
-        </w:rPr>
-        <w:t xml:space="preserve">• Modeled dining-hall traffic and staffing gaps from 18 months of facility logs; surfaced $120K annualized overtime risk and a staffing plan adopted by the student union board.</w:t>
+        <w:t xml:space="preserve">Business Analyst · Lakeside Corp · 2016-2019</w:t>
+      </w:r>
+    </w:p>
+    <w:p>
+      <w:pPr>
+        <w:spacing w:after="80"/>
+      </w:pPr>
+      <w:r>
+        <w:rPr>
+          <w:rFonts w:ascii="Calibri" w:cs="Calibri" w:eastAsia="Calibri" w:hAnsi="Calibri"/>
+          <w:sz w:val="22"/>
+          <w:szCs w:val="22"/>
+        </w:rPr>
+        <w:t xml:space="preserve">• Standardized reporting definitions in SQL and Excel; eliminated duplicate KPI versions used by three departments.</w:t>
+      </w:r>
+    </w:p>
+    <w:p>
+      <w:pPr>
+        <w:spacing w:after="80"/>
+      </w:pPr>
+      <w:r>
+        <w:rPr>
+          <w:rFonts w:ascii="Calibri" w:cs="Calibri" w:eastAsia="Calibri" w:hAnsi="Calibri"/>
+          <w:sz w:val="22"/>
+          <w:szCs w:val="22"/>
+        </w:rPr>
+        <w:t xml:space="preserve">• Facilitated UAT for a billing integration; documented 48 acceptance scenarios with zero rollback on launch.</w:t>
       </w:r>
     </w:p>
     <w:p>
@@ -246,45 +272,6 @@
           <w:sz w:val="22"/>
           <w:szCs w:val="22"/>
         </w:rPr>
-        <w:t xml:space="preserve">Cohort retention capstone (Python + Excel) · Senior thesis · anonymized sample data</w:t>
-      </w:r>
-    </w:p>
-    <w:p>
-      <w:pPr>
-        <w:spacing w:after="80"/>
-      </w:pPr>
-      <w:r>
-        <w:rPr>
-          <w:rFonts w:ascii="Calibri" w:cs="Calibri" w:eastAsia="Calibri" w:hAnsi="Calibri"/>
-          <w:sz w:val="22"/>
-          <w:szCs w:val="22"/>
-        </w:rPr>
-        <w:t xml:space="preserve">• Segmented first-year retention drivers with logistic-style feature exploration; delivered a 12-slide readout and reproducible notebook the department reused for advising outreach.</w:t>
-      </w:r>
-    </w:p>
-    <w:p>
-      <w:pPr>
-        <w:spacing w:after="80"/>
-      </w:pPr>
-      <w:r>
-        <w:rPr>
-          <w:rFonts w:ascii="Calibri" w:cs="Calibri" w:eastAsia="Calibri" w:hAnsi="Calibri"/>
-          <w:sz w:val="22"/>
-          <w:szCs w:val="22"/>
-        </w:rPr>
-        <w:t xml:space="preserve"/>
-      </w:r>
-    </w:p>
-    <w:p>
-      <w:pPr>
-        <w:spacing w:after="80"/>
-      </w:pPr>
-      <w:r>
-        <w:rPr>
-          <w:rFonts w:ascii="Calibri" w:cs="Calibri" w:eastAsia="Calibri" w:hAnsi="Calibri"/>
-          <w:sz w:val="22"/>
-          <w:szCs w:val="22"/>
-        </w:rPr>
         <w:t xml:space="preserve">EDUCATION</w:t>
       </w:r>
     </w:p>
@@ -298,7 +285,7 @@
           <w:sz w:val="22"/>
           <w:szCs w:val="22"/>
         </w:rPr>
-        <w:t xml:space="preserve">BS Economics · State University · May 2024</w:t>
+        <w:t xml:space="preserve">MBA · Midwest University · 2018 · BS Finance · 2014</w:t>
       </w:r>
     </w:p>
     <w:sectPr>

</xml_diff>